<commit_message>
fix(einvoicing): ajustes tras probar contra APIDIAN real
- Un 500 de APIDIAN con explicación (p. ej. empresa sin software) se
  marca como falla de configuración y no se reintenta en bucle.
- Solo se emite con la empresa, el certificado y el software cargados.
- Guía actualizada con la instalación local real y los tropiezos de
  Windows (saltos LF, Debian 11 archivado, URL_API_CERT_MODERNIZER).

Co-Authored-By: Claude Opus 5.5 <noreply@anthropic.com>
</commit_message>
<xml_diff>
--- a/GUIA-FACTURACION-ELECTRONICA-APIDIAN.docx
+++ b/GUIA-FACTURACION-ELECTRONICA-APIDIAN.docx
@@ -57,7 +57,7 @@
           <w:sz w:val="20"/>
           <w:szCs w:val="20"/>
         </w:rPr>
-        <w:t xml:space="preserve">Estado al 3 de octubre de 2026 · rama feat/factura-electronica-apidian (Backend y Frontend)</w:t>
+        <w:t xml:space="preserve">Estado al 5 de octubre de 2026 · rama feat/factura-electronica-apidian (Backend y Frontend)</w:t>
       </w:r>
     </w:p>
     <w:p>
@@ -522,7 +522,7 @@
                 <w:sz w:val="20"/>
                 <w:szCs w:val="20"/>
               </w:rPr>
-              <w:t xml:space="preserve">Pendiente: Docker no está instalado en el equipo</w:t>
+              <w:t xml:space="preserve">Local HECHO (5-oct-2026); VPS pendiente</w:t>
             </w:r>
           </w:p>
         </w:tc>
@@ -3033,6 +3033,21 @@
     </w:p>
     <w:p>
       <w:pPr>
+        <w:spacing w:after="120"/>
+      </w:pPr>
+      <w:r>
+        <w:rPr>
+          <w:b/>
+          <w:bCs/>
+        </w:rPr>
+        <w:t xml:space="preserve">Estado: </w:t>
+      </w:r>
+      <w:r>
+        <w:t xml:space="preserve">YA INSTALADO el 5 de octubre de 2026 en C:UsersUsuarioDesktopproyectosapidian, corriendo en Docker y conectado al backend (Backend/.env). Estos son los pasos que se siguieron, con los tropiezos de Windows ya resueltos.</w:t>
+      </w:r>
+    </w:p>
+    <w:p>
+      <w:pPr>
         <w:pStyle w:val="ListParagraph"/>
         <w:numPr>
           <w:ilvl w:val="0"/>
@@ -3041,7 +3056,7 @@
         <w:spacing w:after="80"/>
       </w:pPr>
       <w:r>
-        <w:t xml:space="preserve">Instalar Docker Desktop para Windows (pide administrador y reinicio).</w:t>
+        <w:t xml:space="preserve">Instalar WSL como administrador (wsl --install --no-distribution), reiniciar, y luego Docker Desktop. Sin WSL, Docker no arranca.</w:t>
       </w:r>
     </w:p>
     <w:p>
@@ -3054,7 +3069,18 @@
         <w:spacing w:after="80"/>
       </w:pPr>
       <w:r>
-        <w:t xml:space="preserve">Clonar APIDIAN fuera del proyecto:</w:t>
+        <w:t xml:space="preserve">Clonar APIDIAN fuera del proyecto y </w:t>
+      </w:r>
+      <w:r>
+        <w:rPr>
+          <w:b/>
+          <w:bCs/>
+        </w:rPr>
+        <w:t xml:space="preserve">forzar saltos de línea LF</w:t>
+      </w:r>
+      <w:r>
+        <w:t xml:space="preserve"> antes de nada. Si git de Windows los deja en CRLF, los catálogos de la DIAN se cargan con un carácter oculto al final de cada código ("01
+") que termina dentro del XML y causa rechazos; y el Dockerfile falla:</w:t>
       </w:r>
     </w:p>
     <w:p>
@@ -3069,7 +3095,52 @@
           <w:sz w:val="19"/>
           <w:szCs w:val="19"/>
         </w:rPr>
-        <w:t xml:space="preserve">git clone https://github.com/facturalatam/apidian.git</w:t>
+        <w:t xml:space="preserve">git clone https://github.com/facturalatam/apidian.git apidian</w:t>
+      </w:r>
+    </w:p>
+    <w:p>
+      <w:pPr>
+        <w:shd w:fill="F2F2F2" w:color="auto" w:val="clear"/>
+        <w:spacing w:after="0"/>
+        <w:ind w:left="240"/>
+      </w:pPr>
+      <w:r>
+        <w:rPr>
+          <w:rFonts w:ascii="Consolas" w:cs="Consolas" w:eastAsia="Consolas" w:hAnsi="Consolas"/>
+          <w:sz w:val="19"/>
+          <w:szCs w:val="19"/>
+        </w:rPr>
+        <w:t xml:space="preserve">cd apidian</w:t>
+      </w:r>
+    </w:p>
+    <w:p>
+      <w:pPr>
+        <w:shd w:fill="F2F2F2" w:color="auto" w:val="clear"/>
+        <w:spacing w:after="0"/>
+        <w:ind w:left="240"/>
+      </w:pPr>
+      <w:r>
+        <w:rPr>
+          <w:rFonts w:ascii="Consolas" w:cs="Consolas" w:eastAsia="Consolas" w:hAnsi="Consolas"/>
+          <w:sz w:val="19"/>
+          <w:szCs w:val="19"/>
+        </w:rPr>
+        <w:t xml:space="preserve">git config core.autocrlf false</w:t>
+      </w:r>
+    </w:p>
+    <w:p>
+      <w:pPr>
+        <w:shd w:fill="F2F2F2" w:color="auto" w:val="clear"/>
+        <w:spacing w:after="0"/>
+        <w:ind w:left="240"/>
+      </w:pPr>
+      <w:r>
+        <w:rPr>
+          <w:rFonts w:ascii="Consolas" w:cs="Consolas" w:eastAsia="Consolas" w:hAnsi="Consolas"/>
+          <w:sz w:val="19"/>
+          <w:szCs w:val="19"/>
+        </w:rPr>
+        <w:t xml:space="preserve">git config core.eol lf</w:t>
       </w:r>
     </w:p>
     <w:p>
@@ -3084,7 +3155,7 @@
           <w:sz w:val="19"/>
           <w:szCs w:val="19"/>
         </w:rPr>
-        <w:t xml:space="preserve">cd apidian</w:t>
+        <w:t xml:space="preserve">git rm -r -q --cached . &amp;&amp; git reset -q --hard</w:t>
       </w:r>
     </w:p>
     <w:p>
@@ -3097,7 +3168,7 @@
         <w:spacing w:after="80"/>
       </w:pPr>
       <w:r>
-        <w:t xml:space="preserve">Seguir la guía oficial INSTALACION.md, opción C (Docker): editar docker/init.sql con usuario y clave de base de datos, copiar docker-compose.yml.example a docker-compose.yml y .env.example a .env.</w:t>
+        <w:t xml:space="preserve">Ajustar el Dockerfile: la imagen base (rash07/php-fpm:8.2) es Debian 11, ya sin soporte; sus paquetes pasaron a archive.debian.org. Hay que reescribir /etc/apt/sources.list a archive.debian.org antes del apt-get (ver el Dockerfile de la copia local).</w:t>
       </w:r>
     </w:p>
     <w:p>
@@ -3110,7 +3181,7 @@
         <w:spacing w:after="80"/>
       </w:pPr>
       <w:r>
-        <w:t xml:space="preserve">En el .env de APIDIAN poner </w:t>
+        <w:t xml:space="preserve">docker-compose.yml (copia del .example) con los puertos solo en </w:t>
       </w:r>
       <w:r>
         <w:rPr>
@@ -3118,10 +3189,10 @@
           <w:sz w:val="20"/>
           <w:szCs w:val="20"/>
         </w:rPr>
-        <w:t xml:space="preserve">VALIDATE_BEFORE_SENDING=true</w:t>
-      </w:r>
-      <w:r>
-        <w:t xml:space="preserve"> (protege contra reenvíos duplicados) y dejar </w:t>
+        <w:t xml:space="preserve">127.0.0.1</w:t>
+      </w:r>
+      <w:r>
+        <w:t xml:space="preserve">, MariaDB sin puerto publicado, </w:t>
       </w:r>
       <w:r>
         <w:rPr>
@@ -3129,10 +3200,21 @@
           <w:sz w:val="20"/>
           <w:szCs w:val="20"/>
         </w:rPr>
-        <w:t xml:space="preserve">ENABLE_API_REGISTER=true</w:t>
-      </w:r>
-      <w:r>
-        <w:t xml:space="preserve"> (permite crear empresas por API).</w:t>
+        <w:t xml:space="preserve">command: --local-infile=1</w:t>
+      </w:r>
+      <w:r>
+        <w:t xml:space="preserve"> y </w:t>
+      </w:r>
+      <w:r>
+        <w:rPr>
+          <w:rFonts w:ascii="Consolas" w:cs="Consolas" w:eastAsia="Consolas" w:hAnsi="Consolas"/>
+          <w:sz w:val="20"/>
+          <w:szCs w:val="20"/>
+        </w:rPr>
+        <w:t xml:space="preserve">MARIADB_ROOT_PASSWORD=${DB_ROOT_PASSWORD}</w:t>
+      </w:r>
+      <w:r>
+        <w:t xml:space="preserve">. docker/init.sql con una clave aleatoria.</w:t>
       </w:r>
     </w:p>
     <w:p>
@@ -3145,37 +3227,83 @@
         <w:spacing w:after="80"/>
       </w:pPr>
       <w:r>
-        <w:t xml:space="preserve">Levantar los contenedores y correr los comandos de Laravel que indica la guía (composer install, migraciones, seeders de catálogos):</w:t>
-      </w:r>
-    </w:p>
-    <w:p>
-      <w:pPr>
-        <w:shd w:fill="F2F2F2" w:color="auto" w:val="clear"/>
-        <w:spacing w:after="0"/>
-        <w:ind w:left="240"/>
-      </w:pPr>
+        <w:t xml:space="preserve">.env de APIDIAN (copia del .env.example): </w:t>
+      </w:r>
       <w:r>
         <w:rPr>
           <w:rFonts w:ascii="Consolas" w:cs="Consolas" w:eastAsia="Consolas" w:hAnsi="Consolas"/>
-          <w:sz w:val="19"/>
-          <w:szCs w:val="19"/>
-        </w:rPr>
-        <w:t xml:space="preserve">docker network create apinet</w:t>
-      </w:r>
-    </w:p>
-    <w:p>
-      <w:pPr>
-        <w:shd w:fill="F2F2F2" w:color="auto" w:val="clear"/>
-        <w:spacing w:after="160"/>
-        <w:ind w:left="240"/>
-      </w:pPr>
+          <w:sz w:val="20"/>
+          <w:szCs w:val="20"/>
+        </w:rPr>
+        <w:t xml:space="preserve">APP_PORT=8080</w:t>
+      </w:r>
+      <w:r>
+        <w:t xml:space="preserve">, </w:t>
+      </w:r>
       <w:r>
         <w:rPr>
           <w:rFonts w:ascii="Consolas" w:cs="Consolas" w:eastAsia="Consolas" w:hAnsi="Consolas"/>
-          <w:sz w:val="19"/>
-          <w:szCs w:val="19"/>
-        </w:rPr>
-        <w:t xml:space="preserve">docker compose up -d</w:t>
+          <w:sz w:val="20"/>
+          <w:szCs w:val="20"/>
+        </w:rPr>
+        <w:t xml:space="preserve">DB_HOST=mariadb_api</w:t>
+      </w:r>
+      <w:r>
+        <w:t xml:space="preserve">, </w:t>
+      </w:r>
+      <w:r>
+        <w:rPr>
+          <w:rFonts w:ascii="Consolas" w:cs="Consolas" w:eastAsia="Consolas" w:hAnsi="Consolas"/>
+          <w:sz w:val="20"/>
+          <w:szCs w:val="20"/>
+        </w:rPr>
+        <w:t xml:space="preserve">DB_PASSWORD</w:t>
+      </w:r>
+      <w:r>
+        <w:t xml:space="preserve"> igual a init.sql, </w:t>
+      </w:r>
+      <w:r>
+        <w:rPr>
+          <w:rFonts w:ascii="Consolas" w:cs="Consolas" w:eastAsia="Consolas" w:hAnsi="Consolas"/>
+          <w:sz w:val="20"/>
+          <w:szCs w:val="20"/>
+        </w:rPr>
+        <w:t xml:space="preserve">VALIDATE_BEFORE_SENDING=true</w:t>
+      </w:r>
+      <w:r>
+        <w:t xml:space="preserve">, </w:t>
+      </w:r>
+      <w:r>
+        <w:rPr>
+          <w:rFonts w:ascii="Consolas" w:cs="Consolas" w:eastAsia="Consolas" w:hAnsi="Consolas"/>
+          <w:sz w:val="20"/>
+          <w:szCs w:val="20"/>
+        </w:rPr>
+        <w:t xml:space="preserve">ENABLE_API_REGISTER=true</w:t>
+      </w:r>
+      <w:r>
+        <w:t xml:space="preserve">, </w:t>
+      </w:r>
+      <w:r>
+        <w:rPr>
+          <w:rFonts w:ascii="Consolas" w:cs="Consolas" w:eastAsia="Consolas" w:hAnsi="Consolas"/>
+          <w:sz w:val="20"/>
+          <w:szCs w:val="20"/>
+        </w:rPr>
+        <w:t xml:space="preserve">ALLOW_PUBLIC_REGISTER=false</w:t>
+      </w:r>
+      <w:r>
+        <w:t xml:space="preserve"> y </w:t>
+      </w:r>
+      <w:r>
+        <w:rPr>
+          <w:b/>
+          <w:bCs/>
+        </w:rPr>
+        <w:t xml:space="preserve">URL_API_CERT_MODERNIZER vacío</w:t>
+      </w:r>
+      <w:r>
+        <w:t xml:space="preserve">: por defecto apunta a un servidor externo al que APIDIAN mandaría el certificado y su clave para convertirlo. Cuidar que la última línea termine en salto de línea.</w:t>
       </w:r>
     </w:p>
     <w:p>
@@ -3188,7 +3316,80 @@
         <w:spacing w:after="80"/>
       </w:pPr>
       <w:r>
-        <w:t xml:space="preserve">En Backend/.env: </w:t>
+        <w:t xml:space="preserve">Levantar y correr la instalación de Laravel dentro del contenedor PHP (composer install tarda ~10 min en una carpeta de Windows):</w:t>
+      </w:r>
+    </w:p>
+    <w:p>
+      <w:pPr>
+        <w:shd w:fill="F2F2F2" w:color="auto" w:val="clear"/>
+        <w:spacing w:after="0"/>
+        <w:ind w:left="240"/>
+      </w:pPr>
+      <w:r>
+        <w:rPr>
+          <w:rFonts w:ascii="Consolas" w:cs="Consolas" w:eastAsia="Consolas" w:hAnsi="Consolas"/>
+          <w:sz w:val="19"/>
+          <w:szCs w:val="19"/>
+        </w:rPr>
+        <w:t xml:space="preserve">docker network create apinet</w:t>
+      </w:r>
+    </w:p>
+    <w:p>
+      <w:pPr>
+        <w:shd w:fill="F2F2F2" w:color="auto" w:val="clear"/>
+        <w:spacing w:after="0"/>
+        <w:ind w:left="240"/>
+      </w:pPr>
+      <w:r>
+        <w:rPr>
+          <w:rFonts w:ascii="Consolas" w:cs="Consolas" w:eastAsia="Consolas" w:hAnsi="Consolas"/>
+          <w:sz w:val="19"/>
+          <w:szCs w:val="19"/>
+        </w:rPr>
+        <w:t xml:space="preserve">docker compose up -d --build</w:t>
+      </w:r>
+    </w:p>
+    <w:p>
+      <w:pPr>
+        <w:shd w:fill="F2F2F2" w:color="auto" w:val="clear"/>
+        <w:spacing w:after="0"/>
+        <w:ind w:left="240"/>
+      </w:pPr>
+      <w:r>
+        <w:rPr>
+          <w:rFonts w:ascii="Consolas" w:cs="Consolas" w:eastAsia="Consolas" w:hAnsi="Consolas"/>
+          <w:sz w:val="19"/>
+          <w:szCs w:val="19"/>
+        </w:rPr>
+        <w:t xml:space="preserve">docker exec php_api sh -c "cd /var/www/html &amp;&amp; composer install --no-interaction"</w:t>
+      </w:r>
+    </w:p>
+    <w:p>
+      <w:pPr>
+        <w:shd w:fill="F2F2F2" w:color="auto" w:val="clear"/>
+        <w:spacing w:after="160"/>
+        <w:ind w:left="240"/>
+      </w:pPr>
+      <w:r>
+        <w:rPr>
+          <w:rFonts w:ascii="Consolas" w:cs="Consolas" w:eastAsia="Consolas" w:hAnsi="Consolas"/>
+          <w:sz w:val="19"/>
+          <w:szCs w:val="19"/>
+        </w:rPr>
+        <w:t xml:space="preserve">docker exec php_api sh -c "cd /var/www/html &amp;&amp; php artisan key:generate --force &amp;&amp; unzip -oq storage.zip &amp;&amp; chmod -R 777 storage bootstrap/cache vendor/mpdf/mpdf &amp;&amp; php artisan config:cache &amp;&amp; php artisan storage:link &amp;&amp; php artisan migrate --seed --force"</w:t>
+      </w:r>
+    </w:p>
+    <w:p>
+      <w:pPr>
+        <w:pStyle w:val="ListParagraph"/>
+        <w:numPr>
+          <w:ilvl w:val="0"/>
+          <w:numId w:val="5"/>
+        </w:numPr>
+        <w:spacing w:after="80"/>
+      </w:pPr>
+      <w:r>
+        <w:t xml:space="preserve">Verificar que los catálogos no tengan el carácter oculto: </w:t>
       </w:r>
       <w:r>
         <w:rPr>
@@ -3196,10 +3397,23 @@
           <w:sz w:val="20"/>
           <w:szCs w:val="20"/>
         </w:rPr>
-        <w:t xml:space="preserve">EINVOICING_PROVIDER=apidian</w:t>
-      </w:r>
-      <w:r>
-        <w:t xml:space="preserve">, </w:t>
+        <w:t xml:space="preserve">select concat('[',code,']') from taxes</w:t>
+      </w:r>
+      <w:r>
+        <w:t xml:space="preserve"> debe dar [01], no "[01" con salto.</w:t>
+      </w:r>
+    </w:p>
+    <w:p>
+      <w:pPr>
+        <w:pStyle w:val="ListParagraph"/>
+        <w:numPr>
+          <w:ilvl w:val="0"/>
+          <w:numId w:val="5"/>
+        </w:numPr>
+        <w:spacing w:after="80"/>
+      </w:pPr>
+      <w:r>
+        <w:t xml:space="preserve">En Backend/.env: </w:t>
       </w:r>
       <w:r>
         <w:rPr>
@@ -3207,10 +3421,10 @@
           <w:sz w:val="20"/>
           <w:szCs w:val="20"/>
         </w:rPr>
-        <w:t xml:space="preserve">APIDIAN_URL=http://localhost:&lt;puerto&gt;/api</w:t>
-      </w:r>
-      <w:r>
-        <w:t xml:space="preserve"> y </w:t>
+        <w:t xml:space="preserve">EINVOICING_PROVIDER=apidian</w:t>
+      </w:r>
+      <w:r>
+        <w:t xml:space="preserve">, </w:t>
       </w:r>
       <w:r>
         <w:rPr>
@@ -3218,10 +3432,41 @@
           <w:sz w:val="20"/>
           <w:szCs w:val="20"/>
         </w:rPr>
+        <w:t xml:space="preserve">APIDIAN_URL=http://127.0.0.1:8080/api</w:t>
+      </w:r>
+      <w:r>
+        <w:t xml:space="preserve"> y </w:t>
+      </w:r>
+      <w:r>
+        <w:rPr>
+          <w:rFonts w:ascii="Consolas" w:cs="Consolas" w:eastAsia="Consolas" w:hAnsi="Consolas"/>
+          <w:sz w:val="20"/>
+          <w:szCs w:val="20"/>
+        </w:rPr>
         <w:t xml:space="preserve">EINVOICING_SECRET_KEY</w:t>
       </w:r>
       <w:r>
         <w:t xml:space="preserve">. Reiniciar el backend: el log debe decir "Facturación electrónica con APIDIAN".</w:t>
+      </w:r>
+    </w:p>
+    <w:p>
+      <w:pPr>
+        <w:pBdr>
+          <w:left w:val="single" w:color="E69500" w:sz="18" w:space="8"/>
+        </w:pBdr>
+        <w:shd w:fill="FFF4E5" w:color="auto" w:val="clear"/>
+        <w:spacing w:after="160" w:before="80"/>
+        <w:ind w:left="240"/>
+      </w:pPr>
+      <w:r>
+        <w:rPr>
+          <w:b/>
+          <w:bCs/>
+        </w:rPr>
+        <w:t xml:space="preserve">Probado contra el APIDIAN local: </w:t>
+      </w:r>
+      <w:r>
+        <w:t xml:space="preserve">el conector de BookiPos crea la empresa, registra la resolución de factura y la de notas crédito. Enviar una factura sin certificado ni software devuelve "fallido" (correcto). Falta probar un envío aceptado: requiere el certificado y el ID de software/set de pruebas de un NIT habilitado en la DIAN.</w:t>
       </w:r>
     </w:p>
     <w:p>

</xml_diff>

<commit_message>
docs(einvoicing): certificado digital gestionado por BookiPos
Agrega a la guía la decisión de la opción 3: BookiPos compra, carga y
renueva el certificado a nombre de cada negocio (software propio), por
qué no se puede firmar por mandato como Alegra sin ser proveedor
tecnológico, y lo que falta para implementarlo (convenio con la entidad
certificadora, contrato de custodia, quién configura, alertas).

Co-Authored-By: Claude Opus 5.5 <noreply@anthropic.com>
</commit_message>
<xml_diff>
--- a/GUIA-FACTURACION-ELECTRONICA-APIDIAN.docx
+++ b/GUIA-FACTURACION-ELECTRONICA-APIDIAN.docx
@@ -155,7 +155,27 @@
         <w:t xml:space="preserve">Modalidad DIAN: </w:t>
       </w:r>
       <w:r>
-        <w:t xml:space="preserve">"software propio". Cada negocio se habilita a su nombre y compra su certificado digital (≈ $100.000/año). BookiPos NO es proveedor tecnológico y no debe presentarse como tal.</w:t>
+        <w:t xml:space="preserve">"software propio". Cada negocio se habilita a su nombre y firma con un certificado digital a su nombre. BookiPos NO es proveedor tecnológico y no debe presentarse como tal.</w:t>
+      </w:r>
+    </w:p>
+    <w:p>
+      <w:pPr>
+        <w:pStyle w:val="ListParagraph"/>
+        <w:numPr>
+          <w:ilvl w:val="0"/>
+          <w:numId w:val="2"/>
+        </w:numPr>
+        <w:spacing w:after="60"/>
+      </w:pPr>
+      <w:r>
+        <w:rPr>
+          <w:b/>
+          <w:bCs/>
+        </w:rPr>
+        <w:t xml:space="preserve">Certificado gestionado por BookiPos (opción 3): </w:t>
+      </w:r>
+      <w:r>
+        <w:t xml:space="preserve">BookiPos compra, carga y renueva el certificado de cada negocio, y su costo va incluido en el plan. El negocio solo valida la identidad de su representante legal una vez. Ver la sección 5.1.</w:t>
       </w:r>
     </w:p>
     <w:p>
@@ -3568,7 +3588,7 @@
         <w:spacing w:after="80"/>
       </w:pPr>
       <w:r>
-        <w:t xml:space="preserve">Comprar su certificado digital (.p12) en una entidad acreditada por la ONAC (GSE, Certicámara, Andes, Camerfirma…). Lo puede comprar donde quiera.</w:t>
+        <w:t xml:space="preserve">Validar la identidad del representante legal ante la entidad certificadora para que BookiPos pueda emitir su certificado digital (ver 5.1). Es lo único del certificado que hace el negocio.</w:t>
       </w:r>
     </w:p>
     <w:p>
@@ -4436,6 +4456,620 @@
     </w:p>
     <w:p>
       <w:pPr>
+        <w:pStyle w:val="Heading2"/>
+      </w:pPr>
+      <w:r>
+        <w:t xml:space="preserve">5.1 El certificado digital lo gestiona BookiPos (opción 3)</w:t>
+      </w:r>
+    </w:p>
+    <w:p>
+      <w:pPr>
+        <w:spacing w:after="120"/>
+      </w:pPr>
+      <w:r>
+        <w:t xml:space="preserve">Decisión del 5 de octubre de 2026. El objetivo es que el negocio no tenga que comprar ni cargar nada, como pasa en Alegra, pero sin cobrar por documento.</w:t>
+      </w:r>
+    </w:p>
+    <w:p>
+      <w:pPr>
+        <w:pStyle w:val="Heading3"/>
+      </w:pPr>
+      <w:r>
+        <w:t xml:space="preserve">Por qué no se puede hacer exactamente como Alegra</w:t>
+      </w:r>
+    </w:p>
+    <w:p>
+      <w:pPr>
+        <w:spacing w:after="120"/>
+      </w:pPr>
+      <w:r>
+        <w:t xml:space="preserve">Alegra es proveedor tecnológico autorizado por la DIAN: firma con SU certificado en nombre del negocio, respaldado por un contrato de mandato. Esa firma por mandato solo la puede hacer un proveedor tecnológico autorizado. En software propio (el modelo de BookiPos con APIDIAN), cada documento se firma con el certificado DEL NEGOCIO. Pagar APIDIAN Enterprise (US$200) no cambia esto: compra software, no la autorización de la DIAN.</w:t>
+      </w:r>
+    </w:p>
+    <w:p>
+      <w:pPr>
+        <w:pStyle w:val="Heading3"/>
+      </w:pPr>
+      <w:r>
+        <w:t xml:space="preserve">Opciones evaluadas</w:t>
+      </w:r>
+    </w:p>
+    <w:tbl>
+      <w:tblPr>
+        <w:tblW w:type="dxa" w:w="9360"/>
+        <w:tblBorders>
+          <w:top w:val="single" w:color="auto" w:sz="4"/>
+          <w:left w:val="single" w:color="auto" w:sz="4"/>
+          <w:bottom w:val="single" w:color="auto" w:sz="4"/>
+          <w:right w:val="single" w:color="auto" w:sz="4"/>
+          <w:insideH w:val="single" w:color="auto" w:sz="4"/>
+          <w:insideV w:val="single" w:color="auto" w:sz="4"/>
+        </w:tblBorders>
+      </w:tblPr>
+      <w:tblGrid>
+        <w:gridCol w:w="2600"/>
+        <w:gridCol w:w="4560"/>
+        <w:gridCol w:w="2200"/>
+      </w:tblGrid>
+      <w:tr>
+        <w:trPr>
+          <w:tblHeader/>
+        </w:trPr>
+        <w:tc>
+          <w:tcPr>
+            <w:tcW w:type="dxa" w:w="2600"/>
+            <w:tcBorders>
+              <w:top w:val="single" w:color="BFBFBF" w:sz="4"/>
+              <w:left w:val="single" w:color="BFBFBF" w:sz="4"/>
+              <w:bottom w:val="single" w:color="BFBFBF" w:sz="4"/>
+              <w:right w:val="single" w:color="BFBFBF" w:sz="4"/>
+            </w:tcBorders>
+            <w:shd w:fill="DCE6F1" w:color="auto" w:val="clear"/>
+            <w:tcMar>
+              <w:top w:type="dxa" w:w="60"/>
+              <w:left w:type="dxa" w:w="100"/>
+              <w:bottom w:type="dxa" w:w="60"/>
+              <w:right w:type="dxa" w:w="100"/>
+            </w:tcMar>
+          </w:tcPr>
+          <w:p>
+            <w:r>
+              <w:rPr>
+                <w:b/>
+                <w:bCs/>
+                <w:sz w:val="20"/>
+                <w:szCs w:val="20"/>
+              </w:rPr>
+              <w:t xml:space="preserve">Opción</w:t>
+            </w:r>
+          </w:p>
+        </w:tc>
+        <w:tc>
+          <w:tcPr>
+            <w:tcW w:type="dxa" w:w="4560"/>
+            <w:tcBorders>
+              <w:top w:val="single" w:color="BFBFBF" w:sz="4"/>
+              <w:left w:val="single" w:color="BFBFBF" w:sz="4"/>
+              <w:bottom w:val="single" w:color="BFBFBF" w:sz="4"/>
+              <w:right w:val="single" w:color="BFBFBF" w:sz="4"/>
+            </w:tcBorders>
+            <w:shd w:fill="DCE6F1" w:color="auto" w:val="clear"/>
+            <w:tcMar>
+              <w:top w:type="dxa" w:w="60"/>
+              <w:left w:type="dxa" w:w="100"/>
+              <w:bottom w:type="dxa" w:w="60"/>
+              <w:right w:type="dxa" w:w="100"/>
+            </w:tcMar>
+          </w:tcPr>
+          <w:p>
+            <w:r>
+              <w:rPr>
+                <w:b/>
+                <w:bCs/>
+                <w:sz w:val="20"/>
+                <w:szCs w:val="20"/>
+              </w:rPr>
+              <w:t xml:space="preserve">Cómo funciona</w:t>
+            </w:r>
+          </w:p>
+        </w:tc>
+        <w:tc>
+          <w:tcPr>
+            <w:tcW w:type="dxa" w:w="2200"/>
+            <w:tcBorders>
+              <w:top w:val="single" w:color="BFBFBF" w:sz="4"/>
+              <w:left w:val="single" w:color="BFBFBF" w:sz="4"/>
+              <w:bottom w:val="single" w:color="BFBFBF" w:sz="4"/>
+              <w:right w:val="single" w:color="BFBFBF" w:sz="4"/>
+            </w:tcBorders>
+            <w:shd w:fill="DCE6F1" w:color="auto" w:val="clear"/>
+            <w:tcMar>
+              <w:top w:type="dxa" w:w="60"/>
+              <w:left w:type="dxa" w:w="100"/>
+              <w:bottom w:type="dxa" w:w="60"/>
+              <w:right w:type="dxa" w:w="100"/>
+            </w:tcMar>
+          </w:tcPr>
+          <w:p>
+            <w:r>
+              <w:rPr>
+                <w:b/>
+                <w:bCs/>
+                <w:sz w:val="20"/>
+                <w:szCs w:val="20"/>
+              </w:rPr>
+              <w:t xml:space="preserve">Decisión</w:t>
+            </w:r>
+          </w:p>
+        </w:tc>
+      </w:tr>
+      <w:tr>
+        <w:tc>
+          <w:tcPr>
+            <w:tcW w:type="dxa" w:w="2600"/>
+            <w:tcBorders>
+              <w:top w:val="single" w:color="BFBFBF" w:sz="4"/>
+              <w:left w:val="single" w:color="BFBFBF" w:sz="4"/>
+              <w:bottom w:val="single" w:color="BFBFBF" w:sz="4"/>
+              <w:right w:val="single" w:color="BFBFBF" w:sz="4"/>
+            </w:tcBorders>
+            <w:tcMar>
+              <w:top w:type="dxa" w:w="60"/>
+              <w:left w:type="dxa" w:w="100"/>
+              <w:bottom w:type="dxa" w:w="60"/>
+              <w:right w:type="dxa" w:w="100"/>
+            </w:tcMar>
+          </w:tcPr>
+          <w:p>
+            <w:r>
+              <w:rPr>
+                <w:b w:val="false"/>
+                <w:bCs w:val="false"/>
+                <w:sz w:val="20"/>
+                <w:szCs w:val="20"/>
+              </w:rPr>
+              <w:t xml:space="preserve">1. BookiPos proveedor tecnológico</w:t>
+            </w:r>
+          </w:p>
+        </w:tc>
+        <w:tc>
+          <w:tcPr>
+            <w:tcW w:type="dxa" w:w="4560"/>
+            <w:tcBorders>
+              <w:top w:val="single" w:color="BFBFBF" w:sz="4"/>
+              <w:left w:val="single" w:color="BFBFBF" w:sz="4"/>
+              <w:bottom w:val="single" w:color="BFBFBF" w:sz="4"/>
+              <w:right w:val="single" w:color="BFBFBF" w:sz="4"/>
+            </w:tcBorders>
+            <w:tcMar>
+              <w:top w:type="dxa" w:w="60"/>
+              <w:left w:type="dxa" w:w="100"/>
+              <w:bottom w:type="dxa" w:w="60"/>
+              <w:right w:type="dxa" w:w="100"/>
+            </w:tcMar>
+          </w:tcPr>
+          <w:p>
+            <w:r>
+              <w:rPr>
+                <w:b w:val="false"/>
+                <w:bCs w:val="false"/>
+                <w:sz w:val="20"/>
+                <w:szCs w:val="20"/>
+              </w:rPr>
+              <w:t xml:space="preserve">Un solo certificado de BookiPos, firma por mandato. Exige autorización DIAN (persona jurídica, capacidad técnica, seguridad de la información tipo ISO 27001, habilitación propia)</w:t>
+            </w:r>
+          </w:p>
+        </w:tc>
+        <w:tc>
+          <w:tcPr>
+            <w:tcW w:type="dxa" w:w="2200"/>
+            <w:tcBorders>
+              <w:top w:val="single" w:color="BFBFBF" w:sz="4"/>
+              <w:left w:val="single" w:color="BFBFBF" w:sz="4"/>
+              <w:bottom w:val="single" w:color="BFBFBF" w:sz="4"/>
+              <w:right w:val="single" w:color="BFBFBF" w:sz="4"/>
+            </w:tcBorders>
+            <w:tcMar>
+              <w:top w:type="dxa" w:w="60"/>
+              <w:left w:type="dxa" w:w="100"/>
+              <w:bottom w:type="dxa" w:w="60"/>
+              <w:right w:type="dxa" w:w="100"/>
+            </w:tcMar>
+          </w:tcPr>
+          <w:p>
+            <w:r>
+              <w:rPr>
+                <w:b w:val="false"/>
+                <w:bCs w:val="false"/>
+                <w:sz w:val="20"/>
+                <w:szCs w:val="20"/>
+              </w:rPr>
+              <w:t xml:space="preserve">Más adelante, con muchos clientes</w:t>
+            </w:r>
+          </w:p>
+        </w:tc>
+      </w:tr>
+      <w:tr>
+        <w:tc>
+          <w:tcPr>
+            <w:tcW w:type="dxa" w:w="2600"/>
+            <w:tcBorders>
+              <w:top w:val="single" w:color="BFBFBF" w:sz="4"/>
+              <w:left w:val="single" w:color="BFBFBF" w:sz="4"/>
+              <w:bottom w:val="single" w:color="BFBFBF" w:sz="4"/>
+              <w:right w:val="single" w:color="BFBFBF" w:sz="4"/>
+            </w:tcBorders>
+            <w:tcMar>
+              <w:top w:type="dxa" w:w="60"/>
+              <w:left w:type="dxa" w:w="100"/>
+              <w:bottom w:type="dxa" w:w="60"/>
+              <w:right w:type="dxa" w:w="100"/>
+            </w:tcMar>
+          </w:tcPr>
+          <w:p>
+            <w:r>
+              <w:rPr>
+                <w:b w:val="false"/>
+                <w:bCs w:val="false"/>
+                <w:sz w:val="20"/>
+                <w:szCs w:val="20"/>
+              </w:rPr>
+              <w:t xml:space="preserve">2. Socio proveedor tecnológico</w:t>
+            </w:r>
+          </w:p>
+        </w:tc>
+        <w:tc>
+          <w:tcPr>
+            <w:tcW w:type="dxa" w:w="4560"/>
+            <w:tcBorders>
+              <w:top w:val="single" w:color="BFBFBF" w:sz="4"/>
+              <w:left w:val="single" w:color="BFBFBF" w:sz="4"/>
+              <w:bottom w:val="single" w:color="BFBFBF" w:sz="4"/>
+              <w:right w:val="single" w:color="BFBFBF" w:sz="4"/>
+            </w:tcBorders>
+            <w:tcMar>
+              <w:top w:type="dxa" w:w="60"/>
+              <w:left w:type="dxa" w:w="100"/>
+              <w:bottom w:type="dxa" w:w="60"/>
+              <w:right w:type="dxa" w:w="100"/>
+            </w:tcMar>
+          </w:tcPr>
+          <w:p>
+            <w:r>
+              <w:rPr>
+                <w:b w:val="false"/>
+                <w:bCs w:val="false"/>
+                <w:sz w:val="20"/>
+                <w:szCs w:val="20"/>
+              </w:rPr>
+              <w:t xml:space="preserve">Alegra API, Dataico, Plemsi… firman por mandato</w:t>
+            </w:r>
+          </w:p>
+        </w:tc>
+        <w:tc>
+          <w:tcPr>
+            <w:tcW w:type="dxa" w:w="2200"/>
+            <w:tcBorders>
+              <w:top w:val="single" w:color="BFBFBF" w:sz="4"/>
+              <w:left w:val="single" w:color="BFBFBF" w:sz="4"/>
+              <w:bottom w:val="single" w:color="BFBFBF" w:sz="4"/>
+              <w:right w:val="single" w:color="BFBFBF" w:sz="4"/>
+            </w:tcBorders>
+            <w:tcMar>
+              <w:top w:type="dxa" w:w="60"/>
+              <w:left w:type="dxa" w:w="100"/>
+              <w:bottom w:type="dxa" w:w="60"/>
+              <w:right w:type="dxa" w:w="100"/>
+            </w:tcMar>
+          </w:tcPr>
+          <w:p>
+            <w:r>
+              <w:rPr>
+                <w:b w:val="false"/>
+                <w:bCs w:val="false"/>
+                <w:sz w:val="20"/>
+                <w:szCs w:val="20"/>
+              </w:rPr>
+              <w:t xml:space="preserve">Descartada: cobro por documento</w:t>
+            </w:r>
+          </w:p>
+        </w:tc>
+      </w:tr>
+      <w:tr>
+        <w:tc>
+          <w:tcPr>
+            <w:tcW w:type="dxa" w:w="2600"/>
+            <w:tcBorders>
+              <w:top w:val="single" w:color="BFBFBF" w:sz="4"/>
+              <w:left w:val="single" w:color="BFBFBF" w:sz="4"/>
+              <w:bottom w:val="single" w:color="BFBFBF" w:sz="4"/>
+              <w:right w:val="single" w:color="BFBFBF" w:sz="4"/>
+            </w:tcBorders>
+            <w:tcMar>
+              <w:top w:type="dxa" w:w="60"/>
+              <w:left w:type="dxa" w:w="100"/>
+              <w:bottom w:type="dxa" w:w="60"/>
+              <w:right w:type="dxa" w:w="100"/>
+            </w:tcMar>
+          </w:tcPr>
+          <w:p>
+            <w:r>
+              <w:rPr>
+                <w:b w:val="false"/>
+                <w:bCs w:val="false"/>
+                <w:sz w:val="20"/>
+                <w:szCs w:val="20"/>
+              </w:rPr>
+              <w:t xml:space="preserve">3. BookiPos gestiona el certificado del negocio</w:t>
+            </w:r>
+          </w:p>
+        </w:tc>
+        <w:tc>
+          <w:tcPr>
+            <w:tcW w:type="dxa" w:w="4560"/>
+            <w:tcBorders>
+              <w:top w:val="single" w:color="BFBFBF" w:sz="4"/>
+              <w:left w:val="single" w:color="BFBFBF" w:sz="4"/>
+              <w:bottom w:val="single" w:color="BFBFBF" w:sz="4"/>
+              <w:right w:val="single" w:color="BFBFBF" w:sz="4"/>
+            </w:tcBorders>
+            <w:tcMar>
+              <w:top w:type="dxa" w:w="60"/>
+              <w:left w:type="dxa" w:w="100"/>
+              <w:bottom w:type="dxa" w:w="60"/>
+              <w:right w:type="dxa" w:w="100"/>
+            </w:tcMar>
+          </w:tcPr>
+          <w:p>
+            <w:r>
+              <w:rPr>
+                <w:b w:val="false"/>
+                <w:bCs w:val="false"/>
+                <w:sz w:val="20"/>
+                <w:szCs w:val="20"/>
+              </w:rPr>
+              <w:t xml:space="preserve">Certificado a nombre del negocio, pero BookiPos lo compra, carga, custodia y renueva</w:t>
+            </w:r>
+          </w:p>
+        </w:tc>
+        <w:tc>
+          <w:tcPr>
+            <w:tcW w:type="dxa" w:w="2200"/>
+            <w:tcBorders>
+              <w:top w:val="single" w:color="BFBFBF" w:sz="4"/>
+              <w:left w:val="single" w:color="BFBFBF" w:sz="4"/>
+              <w:bottom w:val="single" w:color="BFBFBF" w:sz="4"/>
+              <w:right w:val="single" w:color="BFBFBF" w:sz="4"/>
+            </w:tcBorders>
+            <w:tcMar>
+              <w:top w:type="dxa" w:w="60"/>
+              <w:left w:type="dxa" w:w="100"/>
+              <w:bottom w:type="dxa" w:w="60"/>
+              <w:right w:type="dxa" w:w="100"/>
+            </w:tcMar>
+          </w:tcPr>
+          <w:p>
+            <w:r>
+              <w:rPr>
+                <w:b w:val="false"/>
+                <w:bCs w:val="false"/>
+                <w:sz w:val="20"/>
+                <w:szCs w:val="20"/>
+              </w:rPr>
+              <w:t xml:space="preserve">ELEGIDA</w:t>
+            </w:r>
+          </w:p>
+        </w:tc>
+      </w:tr>
+    </w:tbl>
+    <w:p>
+      <w:pPr>
+        <w:spacing w:after="120"/>
+      </w:pPr>
+    </w:p>
+    <w:p>
+      <w:pPr>
+        <w:pStyle w:val="Heading3"/>
+      </w:pPr>
+      <w:r>
+        <w:t xml:space="preserve">Cómo funciona la opción 3</w:t>
+      </w:r>
+    </w:p>
+    <w:p>
+      <w:pPr>
+        <w:pStyle w:val="ListParagraph"/>
+        <w:numPr>
+          <w:ilvl w:val="0"/>
+          <w:numId w:val="7"/>
+        </w:numPr>
+        <w:spacing w:after="80"/>
+      </w:pPr>
+      <w:r>
+        <w:t xml:space="preserve">Al contratar la facturación electrónica, BookiPos solicita el certificado a nombre del negocio ante la entidad certificadora aliada.</w:t>
+      </w:r>
+    </w:p>
+    <w:p>
+      <w:pPr>
+        <w:pStyle w:val="ListParagraph"/>
+        <w:numPr>
+          <w:ilvl w:val="0"/>
+          <w:numId w:val="7"/>
+        </w:numPr>
+        <w:spacing w:after="80"/>
+      </w:pPr>
+      <w:r>
+        <w:t xml:space="preserve">El representante legal del negocio valida su identidad (normalmente biométrica y en línea, unos minutos). Es el único paso que hace el negocio y no se puede evitar: lo exige la entidad certificadora.</w:t>
+      </w:r>
+    </w:p>
+    <w:p>
+      <w:pPr>
+        <w:pStyle w:val="ListParagraph"/>
+        <w:numPr>
+          <w:ilvl w:val="0"/>
+          <w:numId w:val="7"/>
+        </w:numPr>
+        <w:spacing w:after="80"/>
+      </w:pPr>
+      <w:r>
+        <w:t xml:space="preserve">La entidad entrega el .p12 y su clave a BookiPos. Alguien de BookiPos lo carga en el asistente; pasa directo a APIDIAN y BookiPos no lo guarda en su base.</w:t>
+      </w:r>
+    </w:p>
+    <w:p>
+      <w:pPr>
+        <w:pStyle w:val="ListParagraph"/>
+        <w:numPr>
+          <w:ilvl w:val="0"/>
+          <w:numId w:val="7"/>
+        </w:numPr>
+        <w:spacing w:after="80"/>
+      </w:pPr>
+      <w:r>
+        <w:t xml:space="preserve">BookiPos lo renueva antes de que venza: el sistema guarda la fecha de vencimiento (certificateExpiresAt) y debe avisar con tiempo.</w:t>
+      </w:r>
+    </w:p>
+    <w:p>
+      <w:pPr>
+        <w:pStyle w:val="ListParagraph"/>
+        <w:numPr>
+          <w:ilvl w:val="0"/>
+          <w:numId w:val="7"/>
+        </w:numPr>
+        <w:spacing w:after="80"/>
+      </w:pPr>
+      <w:r>
+        <w:t xml:space="preserve">El costo (≈ $100.000–180.000/año por NIT, menos con convenio) va incluido en el plan con facturación electrónica: unos $8.000–15.000/mes.</w:t>
+      </w:r>
+    </w:p>
+    <w:p>
+      <w:pPr>
+        <w:pStyle w:val="Heading3"/>
+      </w:pPr>
+      <w:r>
+        <w:t xml:space="preserve">Lo que hay que hacer para implementarla</w:t>
+      </w:r>
+    </w:p>
+    <w:p>
+      <w:pPr>
+        <w:pStyle w:val="ListParagraph"/>
+        <w:numPr>
+          <w:ilvl w:val="0"/>
+          <w:numId w:val="2"/>
+        </w:numPr>
+        <w:spacing w:after="60"/>
+      </w:pPr>
+      <w:r>
+        <w:rPr>
+          <w:b/>
+          <w:bCs/>
+        </w:rPr>
+        <w:t xml:space="preserve">Convenio: </w:t>
+      </w:r>
+      <w:r>
+        <w:t xml:space="preserve">contactar a GSE, Certicámara, Andes SCD o Camerfirma y pedir su programa de distribuidores/aliados (precio por volumen y emisión a nombre de terceros con validación remota).</w:t>
+      </w:r>
+    </w:p>
+    <w:p>
+      <w:pPr>
+        <w:pStyle w:val="ListParagraph"/>
+        <w:numPr>
+          <w:ilvl w:val="0"/>
+          <w:numId w:val="2"/>
+        </w:numPr>
+        <w:spacing w:after="60"/>
+      </w:pPr>
+      <w:r>
+        <w:rPr>
+          <w:b/>
+          <w:bCs/>
+        </w:rPr>
+        <w:t xml:space="preserve">Contrato con cada cliente: </w:t>
+      </w:r>
+      <w:r>
+        <w:t xml:space="preserve">cláusula de custodia del certificado y autorización para usarlo en la emisión. No es el mandato de un proveedor tecnológico: el negocio sigue siendo el facturador. Que lo revise el contador o un abogado.</w:t>
+      </w:r>
+    </w:p>
+    <w:p>
+      <w:pPr>
+        <w:pStyle w:val="ListParagraph"/>
+        <w:numPr>
+          <w:ilvl w:val="0"/>
+          <w:numId w:val="2"/>
+        </w:numPr>
+        <w:spacing w:after="60"/>
+      </w:pPr>
+      <w:r>
+        <w:rPr>
+          <w:b/>
+          <w:bCs/>
+        </w:rPr>
+        <w:t xml:space="preserve">Quién configura: </w:t>
+      </w:r>
+      <w:r>
+        <w:t xml:space="preserve">hoy el permiso einvoicing.configure lo tienen el Dueño y el Administrador DEL NEGOCIO. Con la opción 3 la carga la hace personal de BookiPos. Hay que decidir el mecanismo: un panel interno de BookiPos (control-plane) que opere sobre la empresa, o un acceso de soporte temporal que el dueño autoriza. Recomendado: panel interno, con registro de auditoría de quién cargó cada certificado.</w:t>
+      </w:r>
+    </w:p>
+    <w:p>
+      <w:pPr>
+        <w:pStyle w:val="ListParagraph"/>
+        <w:numPr>
+          <w:ilvl w:val="0"/>
+          <w:numId w:val="2"/>
+        </w:numPr>
+        <w:spacing w:after="60"/>
+      </w:pPr>
+      <w:r>
+        <w:rPr>
+          <w:b/>
+          <w:bCs/>
+        </w:rPr>
+        <w:t xml:space="preserve">Guardar el .p12 mientras llega al asistente: </w:t>
+      </w:r>
+      <w:r>
+        <w:t xml:space="preserve">nunca por correo ni chat. Entregarlo por un canal cifrado y borrarlo después de cargarlo; la copia de respaldo vive en la base de APIDIAN (con backups cifrados).</w:t>
+      </w:r>
+    </w:p>
+    <w:p>
+      <w:pPr>
+        <w:pStyle w:val="ListParagraph"/>
+        <w:numPr>
+          <w:ilvl w:val="0"/>
+          <w:numId w:val="2"/>
+        </w:numPr>
+        <w:spacing w:after="60"/>
+      </w:pPr>
+      <w:r>
+        <w:rPr>
+          <w:b/>
+          <w:bCs/>
+        </w:rPr>
+        <w:t xml:space="preserve">Alertas de renovación: </w:t>
+      </w:r>
+      <w:r>
+        <w:t xml:space="preserve">aviso interno a BookiPos 45 y 15 días antes del vencimiento de cada certificado.</w:t>
+      </w:r>
+    </w:p>
+    <w:p>
+      <w:pPr>
+        <w:pStyle w:val="ListParagraph"/>
+        <w:numPr>
+          <w:ilvl w:val="0"/>
+          <w:numId w:val="2"/>
+        </w:numPr>
+        <w:spacing w:after="60"/>
+      </w:pPr>
+      <w:r>
+        <w:rPr>
+          <w:b/>
+          <w:bCs/>
+        </w:rPr>
+        <w:t xml:space="preserve">Precios: </w:t>
+      </w:r>
+      <w:r>
+        <w:t xml:space="preserve">reflejar el costo del certificado en plans.ts y en la web (o como complemento de "Facturación electrónica").</w:t>
+      </w:r>
+    </w:p>
+    <w:p>
+      <w:pPr>
         <w:pStyle w:val="Heading1"/>
       </w:pPr>
       <w:r>
@@ -4496,6 +5130,19 @@
       </w:pPr>
       <w:r>
         <w:t xml:space="preserve">Subida del .p12: leer el archivo en el navegador y mandarlo en base64 (máx. 64 KB).</w:t>
+      </w:r>
+    </w:p>
+    <w:p>
+      <w:pPr>
+        <w:pStyle w:val="ListParagraph"/>
+        <w:numPr>
+          <w:ilvl w:val="0"/>
+          <w:numId w:val="2"/>
+        </w:numPr>
+        <w:spacing w:after="60"/>
+      </w:pPr>
+      <w:r>
+        <w:t xml:space="preserve">Con la opción 3 (sección 5.1), el paso del certificado lo hace personal de BookiPos, no el negocio: decidir si el asistente vive en un panel interno de BookiPos o detrás de un acceso de soporte autorizado.</w:t>
       </w:r>
     </w:p>
     <w:p>
@@ -5654,6 +6301,18 @@
       </w:pPr>
     </w:lvl>
   </w:abstractNum>
+  <w:abstractNum w:abstractNumId="8" w15:restartNumberingAfterBreak="0">
+    <w:multiLevelType w:val="hybridMultilevel"/>
+    <w:lvl w:ilvl="0" w:tentative="1">
+      <w:start w:val="1"/>
+      <w:numFmt w:val="decimal"/>
+      <w:lvlText w:val="%1."/>
+      <w:lvlJc w:val="left"/>
+      <w:pPr>
+        <w:ind w:left="720" w:hanging="360"/>
+      </w:pPr>
+    </w:lvl>
+  </w:abstractNum>
   <w:num w:numId="1">
     <w:abstractNumId w:val="1"/>
     <w:lvlOverride w:ilvl="0">
@@ -5686,6 +6345,12 @@
   </w:num>
   <w:num w:numId="6">
     <w:abstractNumId w:val="7"/>
+    <w:lvlOverride w:ilvl="0">
+      <w:startOverride w:val="1"/>
+    </w:lvlOverride>
+  </w:num>
+  <w:num w:numId="7">
+    <w:abstractNumId w:val="8"/>
     <w:lvlOverride w:ilvl="0">
       <w:startOverride w:val="1"/>
     </w:lvlOverride>

</xml_diff>

<commit_message>
docs(einvoicing): avance de la fase 4 en la guía
Co-Authored-By: Claude Opus 5.5 <noreply@anthropic.com>
</commit_message>
<xml_diff>
--- a/GUIA-FACTURACION-ELECTRONICA-APIDIAN.docx
+++ b/GUIA-FACTURACION-ELECTRONICA-APIDIAN.docx
@@ -800,7 +800,7 @@
                 <w:sz w:val="20"/>
                 <w:szCs w:val="20"/>
               </w:rPr>
-              <w:t xml:space="preserve">Parcial (el POS ya muestra el estado)</w:t>
+              <w:t xml:space="preserve">Casi lista (6-oct-2026): faltan alertas y tope de propina</w:t>
             </w:r>
           </w:p>
         </w:tc>
@@ -5176,7 +5176,7 @@
         <w:pStyle w:val="Heading2"/>
       </w:pPr>
       <w:r>
-        <w:t xml:space="preserve">6.2 Fase 4 — POS y panel</w:t>
+        <w:t xml:space="preserve">6.2 Fase 4 — POS y panel (casi lista)</w:t>
       </w:r>
     </w:p>
     <w:p>
@@ -5193,20 +5193,30 @@
           <w:b/>
           <w:bCs/>
         </w:rPr>
-        <w:t xml:space="preserve">Datos del cliente en el POS: </w:t>
-      </w:r>
-      <w:r>
-        <w:t xml:space="preserve">agregar los campos dirección y tipo de documento (13 CC, 31 NIT, 22 CE, 41 pasaporte). El backend ya los acepta (customer.address, customer.idType en la venta). </w:t>
-      </w:r>
+        <w:t xml:space="preserve">HECHO: </w:t>
+      </w:r>
+      <w:r>
+        <w:t xml:space="preserve">el POS pide tipo de documento y dirección del cliente, y avisa exactamente qué dato falta antes de cobrar (a un cliente identificado la DIAN le exige dirección y teléfono). Al escoger un cliente del directorio se copian sus datos; al guardarlo, también la dirección y el correo.</w:t>
+      </w:r>
+    </w:p>
+    <w:p>
+      <w:pPr>
+        <w:pStyle w:val="ListParagraph"/>
+        <w:numPr>
+          <w:ilvl w:val="0"/>
+          <w:numId w:val="2"/>
+        </w:numPr>
+        <w:spacing w:after="60"/>
+      </w:pPr>
       <w:r>
         <w:rPr>
           <w:b/>
           <w:bCs/>
         </w:rPr>
-        <w:t xml:space="preserve">Mientras no estén, facturar con datos de un cliente da "falta dirección"</w:t>
-      </w:r>
-      <w:r>
-        <w:t xml:space="preserve">; consumidor final funciona.</w:t>
+        <w:t xml:space="preserve">HECHO: </w:t>
+      </w:r>
+      <w:r>
+        <w:t xml:space="preserve">/panel/facturacion y /pos/facturacion muestran el estado ante la DIAN de cada factura (src/lib/einvoicing-status.ts), el motivo de rechazo (components/ui/dian-detail.tsx), el botón Reenviar, y en el panel la descarga de PDF y XML. La nota crédito solo se ofrece sobre facturas aceptadas.</w:t>
       </w:r>
     </w:p>
     <w:p>
@@ -5219,20 +5229,14 @@
         <w:spacing w:after="60"/>
       </w:pPr>
       <w:r>
-        <w:t xml:space="preserve">Panel /panel/facturacion: mostrar dianStatus, dianMessage y dianErrors; botón "Reenviar" (retryDocument) y descargas de PDF/XML (downloadDocumentFile).</w:t>
-      </w:r>
-    </w:p>
-    <w:p>
-      <w:pPr>
-        <w:pStyle w:val="ListParagraph"/>
-        <w:numPr>
-          <w:ilvl w:val="0"/>
-          <w:numId w:val="2"/>
-        </w:numPr>
-        <w:spacing w:after="60"/>
-      </w:pPr>
-      <w:r>
-        <w:t xml:space="preserve">Recibo impreso: usar el CUFE y el qrUrl oficiales del documento aceptado.</w:t>
+        <w:rPr>
+          <w:b/>
+          <w:bCs/>
+        </w:rPr>
+        <w:t xml:space="preserve">HECHO: </w:t>
+      </w:r>
+      <w:r>
+        <w:t xml:space="preserve">las dos representaciones gráficas usan el CUFE y el QR oficiales, distinguen pruebas/simulación de producción y muestran la propina aparte del total.</w:t>
       </w:r>
     </w:p>
     <w:p>

</xml_diff>

<commit_message>
feat(einvoicing): set de pruebas de la DIAN para la habilitación
- Envía el set que exige la DIAN para software propio (8 facturas, 1 nota
  crédito, 1 nota débito) en modo asíncrono con la numeración de pruebas,
  y consulta el resultado por ZipKey. Cada reenvío usa números nuevos.
- Nota débito en el traductor de APIDIAN (solo para el set).
- Producción bloqueada hasta que las 10 salgan aceptadas.
- Las facturas normales en habilitación ya no van al set de pruebas.
- Guía actualizada.

Probado: pasos 1-3 contra APIDIAN local real; 4-5 en modo simulado.

Co-Authored-By: Claude Opus 5.5 <noreply@anthropic.com>
</commit_message>
<xml_diff>
--- a/GUIA-FACTURACION-ELECTRONICA-APIDIAN.docx
+++ b/GUIA-FACTURACION-ELECTRONICA-APIDIAN.docx
@@ -714,7 +714,7 @@
                 <w:sz w:val="20"/>
                 <w:szCs w:val="20"/>
               </w:rPr>
-              <w:t xml:space="preserve">Pendiente (los endpoints ya existen)</w:t>
+              <w:t xml:space="preserve">HECHO (6-oct-2026); falta probar con un NIT real</w:t>
             </w:r>
           </w:p>
         </w:tc>
@@ -4118,7 +4118,7 @@
                 <w:sz w:val="20"/>
                 <w:szCs w:val="20"/>
               </w:rPr>
-              <w:t xml:space="preserve">(Fase 3) enviar el set de pruebas</w:t>
+              <w:t xml:space="preserve">POST /einvoicing/connection/:nit/test-set y .../test-set/check</w:t>
             </w:r>
           </w:p>
         </w:tc>
@@ -4146,7 +4146,7 @@
                 <w:sz w:val="20"/>
                 <w:szCs w:val="20"/>
               </w:rPr>
-              <w:t xml:space="preserve">Pendiente de construir</w:t>
+              <w:t xml:space="preserve">Manda el set (8 facturas, 1 NC, 1 ND) y consulta su resultado</w:t>
             </w:r>
           </w:p>
         </w:tc>
@@ -5081,7 +5081,7 @@
         <w:pStyle w:val="Heading2"/>
       </w:pPr>
       <w:r>
-        <w:t xml:space="preserve">6.1 Fase 3 — Asistente de habilitación (panel)</w:t>
+        <w:t xml:space="preserve">6.1 Fase 3 — Asistente de habilitación (HECHO)</w:t>
       </w:r>
     </w:p>
     <w:p>
@@ -5094,7 +5094,11 @@
         <w:spacing w:after="60"/>
       </w:pPr>
       <w:r>
-        <w:t xml:space="preserve">Pantalla nueva, por ejemplo </w:t>
+        <w:rPr>
+          <w:b/>
+          <w:bCs/>
+        </w:rPr>
+        <w:t xml:space="preserve">Pantalla: </w:t>
       </w:r>
       <w:r>
         <w:rPr>
@@ -5105,18 +5109,7 @@
         <w:t xml:space="preserve">/panel/facturacion/conexion</w:t>
       </w:r>
       <w:r>
-        <w:t xml:space="preserve">, que recorra los pasos de la sección 5 con su estado. El cliente HTTP ya existe en </w:t>
-      </w:r>
-      <w:r>
-        <w:rPr>
-          <w:rFonts w:ascii="Consolas" w:cs="Consolas" w:eastAsia="Consolas" w:hAnsi="Consolas"/>
-          <w:sz w:val="20"/>
-          <w:szCs w:val="20"/>
-        </w:rPr>
-        <w:t xml:space="preserve">Frontend/src/lib/erp/api-einvoicing.ts</w:t>
-      </w:r>
-      <w:r>
-        <w:t xml:space="preserve"> (listConnections, registerCompany, uploadCertificate, configureSoftware, syncResolutions, getNumberingRanges, setEnvironment).</w:t>
+        <w:t xml:space="preserve"> (menú Cumplimiento → Conexión DIAN, permiso einvoicing.configure). Una tarjeta por NIT con los 5 pasos; si el facturador rechaza algo, el motivo queda arriba de la tarjeta.</w:t>
       </w:r>
     </w:p>
     <w:p>
@@ -5129,7 +5122,14 @@
         <w:spacing w:after="60"/>
       </w:pPr>
       <w:r>
-        <w:t xml:space="preserve">Subida del .p12: leer el archivo en el navegador y mandarlo en base64 (máx. 64 KB).</w:t>
+        <w:rPr>
+          <w:b/>
+          <w:bCs/>
+        </w:rPr>
+        <w:t xml:space="preserve">Set de pruebas: </w:t>
+      </w:r>
+      <w:r>
+        <w:t xml:space="preserve">software propio exige 8 facturas, 1 nota crédito y 1 nota débito. BookiPos las arma (casos variados de IVA, descuento y exento), las manda en modo asíncrono con la numeración de pruebas de la DIAN (SETP 990000000–995000000) y consulta el resultado por su ZipKey. Cada reenvío usa números nuevos. Producción queda bloqueada hasta que las 10 salgan aceptadas.</w:t>
       </w:r>
     </w:p>
     <w:p>
@@ -5142,7 +5142,14 @@
         <w:spacing w:after="60"/>
       </w:pPr>
       <w:r>
-        <w:t xml:space="preserve">Con la opción 3 (sección 5.1), el paso del certificado lo hace personal de BookiPos, no el negocio: decidir si el asistente vive en un panel interno de BookiPos o detrás de un acceso de soporte autorizado.</w:t>
+        <w:rPr>
+          <w:b/>
+          <w:bCs/>
+        </w:rPr>
+        <w:t xml:space="preserve">Producción: </w:t>
+      </w:r>
+      <w:r>
+        <w:t xml:space="preserve">primero se cambia el ambiente y enseguida se trae de la DIAN el rango autorizado (con su clave técnica) y se asigna a cada sede: el facturador ata cada resolución al ambiente en que se registra.</w:t>
       </w:r>
     </w:p>
     <w:p>
@@ -5155,7 +5162,14 @@
         <w:spacing w:after="60"/>
       </w:pPr>
       <w:r>
-        <w:t xml:space="preserve">Set de pruebas: construir en el backend el envío de los documentos que pide la DIAN a /ubl2.1/invoice/{testSetId} (modo asíncrono) y consultar el resultado con /ubl2.1/status/zip/{zipKey}. Al aprobarse, permitir el paso a producción.</w:t>
+        <w:rPr>
+          <w:b/>
+          <w:bCs/>
+        </w:rPr>
+        <w:t xml:space="preserve">Probado (6-oct-2026): </w:t>
+      </w:r>
+      <w:r>
+        <w:t xml:space="preserve">pasos 1 a 3 contra el APIDIAN local real (empresa creada, certificado de prueba cargado con su vencimiento, software registrado); pasos 4 y 5 en modo simulado. El set NO se mandó a la DIAN real: requiere el certificado y los IDs de un NIT real.</w:t>
       </w:r>
     </w:p>
     <w:p>
@@ -5168,7 +5182,14 @@
         <w:spacing w:after="60"/>
       </w:pPr>
       <w:r>
-        <w:t xml:space="preserve">Agregar el ítem al menú en Frontend/src/lib/erp/navigation.ts con requiredPermissions ["einvoicing.configure"].</w:t>
+        <w:rPr>
+          <w:b/>
+          <w:bCs/>
+        </w:rPr>
+        <w:t xml:space="preserve">Importante: </w:t>
+      </w:r>
+      <w:r>
+        <w:t xml:space="preserve">mientras un NIT está en habilitación, las facturas normales del POS van por el envío síncrono, NO al set de pruebas. El set solo lo manda el asistente.</w:t>
       </w:r>
     </w:p>
     <w:p>

</xml_diff>